<commit_message>
Update CRM Deployment Tool PRD to v0.3 — close open questions
</commit_message>
<xml_diff>
--- a/PRDs/CBM-PRD-CRM-Deploy.docx
+++ b/PRDs/CBM-PRD-CRM-Deploy.docx
@@ -45,7 +45,7 @@
           <w:sz w:val="20"/>
           <w:szCs w:val="20"/>
         </w:rPr>
-        <w:t xml:space="preserve">Version 0.2  |  March 2026  |  Cleveland Business Mentors</w:t>
+        <w:t xml:space="preserve">Version 0.3  |  March 2026  |  Cleveland Business Mentors</w:t>
       </w:r>
     </w:p>
     <w:p>
@@ -5036,7 +5036,7 @@
           <w:sz w:val="22"/>
           <w:szCs w:val="22"/>
         </w:rPr>
-        <w:t xml:space="preserve">Disable root SSH login</w:t>
+        <w:t xml:space="preserve">Connect to Droplet as root for initial setup</w:t>
       </w:r>
     </w:p>
     <w:p>
@@ -5054,7 +5054,7 @@
           <w:sz w:val="22"/>
           <w:szCs w:val="22"/>
         </w:rPr>
-        <w:t xml:space="preserve">Enforce SSH key-based authentication (disable password login)</w:t>
+        <w:t xml:space="preserve">Create non-root sudo user: cbmadmin</w:t>
       </w:r>
     </w:p>
     <w:p>
@@ -5072,7 +5072,7 @@
           <w:sz w:val="22"/>
           <w:szCs w:val="22"/>
         </w:rPr>
-        <w:t xml:space="preserve">Configure swap space (2GB, recommended for 2GB RAM Droplets)</w:t>
+        <w:t xml:space="preserve">Copy root SSH authorized_keys to cbmadmin user</w:t>
       </w:r>
     </w:p>
     <w:p>
@@ -5090,7 +5090,7 @@
           <w:sz w:val="22"/>
           <w:szCs w:val="22"/>
         </w:rPr>
-        <w:t xml:space="preserve">Update apt package index</w:t>
+        <w:t xml:space="preserve">Add cbmadmin to sudoers group</w:t>
       </w:r>
     </w:p>
     <w:p>
@@ -5108,7 +5108,147 @@
           <w:sz w:val="22"/>
           <w:szCs w:val="22"/>
         </w:rPr>
+        <w:t xml:space="preserve">Disable root SSH login</w:t>
+      </w:r>
+    </w:p>
+    <w:p>
+      <w:pPr>
+        <w:pStyle w:val="ListParagraph"/>
+        <w:numPr>
+          <w:ilvl w:val="0"/>
+          <w:numId w:val="2"/>
+        </w:numPr>
+        <w:spacing w:after="80"/>
+      </w:pPr>
+      <w:r>
+        <w:rPr>
+          <w:rFonts w:ascii="Arial" w:cs="Arial" w:eastAsia="Arial" w:hAnsi="Arial"/>
+          <w:sz w:val="22"/>
+          <w:szCs w:val="22"/>
+        </w:rPr>
+        <w:t xml:space="preserve">Disable SSH password authentication (key-based only)</w:t>
+      </w:r>
+    </w:p>
+    <w:p>
+      <w:pPr>
+        <w:pStyle w:val="ListParagraph"/>
+        <w:numPr>
+          <w:ilvl w:val="0"/>
+          <w:numId w:val="2"/>
+        </w:numPr>
+        <w:spacing w:after="80"/>
+      </w:pPr>
+      <w:r>
+        <w:rPr>
+          <w:rFonts w:ascii="Arial" w:cs="Arial" w:eastAsia="Arial" w:hAnsi="Arial"/>
+          <w:sz w:val="22"/>
+          <w:szCs w:val="22"/>
+        </w:rPr>
+        <w:t xml:space="preserve">Restart SSH service</w:t>
+      </w:r>
+    </w:p>
+    <w:p>
+      <w:pPr>
+        <w:pStyle w:val="ListParagraph"/>
+        <w:numPr>
+          <w:ilvl w:val="0"/>
+          <w:numId w:val="2"/>
+        </w:numPr>
+        <w:spacing w:after="80"/>
+      </w:pPr>
+      <w:r>
+        <w:rPr>
+          <w:rFonts w:ascii="Arial" w:cs="Arial" w:eastAsia="Arial" w:hAnsi="Arial"/>
+          <w:sz w:val="22"/>
+          <w:szCs w:val="22"/>
+        </w:rPr>
+        <w:t xml:space="preserve">Reconnect as cbmadmin for all subsequent phases</w:t>
+      </w:r>
+    </w:p>
+    <w:p>
+      <w:pPr>
+        <w:pStyle w:val="ListParagraph"/>
+        <w:numPr>
+          <w:ilvl w:val="0"/>
+          <w:numId w:val="2"/>
+        </w:numPr>
+        <w:spacing w:after="80"/>
+      </w:pPr>
+      <w:r>
+        <w:rPr>
+          <w:rFonts w:ascii="Arial" w:cs="Arial" w:eastAsia="Arial" w:hAnsi="Arial"/>
+          <w:sz w:val="22"/>
+          <w:szCs w:val="22"/>
+        </w:rPr>
+        <w:t xml:space="preserve">Configure swap space (2GB, recommended for 2GB RAM Droplets)</w:t>
+      </w:r>
+    </w:p>
+    <w:p>
+      <w:pPr>
+        <w:pStyle w:val="ListParagraph"/>
+        <w:numPr>
+          <w:ilvl w:val="0"/>
+          <w:numId w:val="2"/>
+        </w:numPr>
+        <w:spacing w:after="80"/>
+      </w:pPr>
+      <w:r>
+        <w:rPr>
+          <w:rFonts w:ascii="Arial" w:cs="Arial" w:eastAsia="Arial" w:hAnsi="Arial"/>
+          <w:sz w:val="22"/>
+          <w:szCs w:val="22"/>
+        </w:rPr>
+        <w:t xml:space="preserve">Update apt package index</w:t>
+      </w:r>
+    </w:p>
+    <w:p>
+      <w:pPr>
+        <w:pStyle w:val="ListParagraph"/>
+        <w:numPr>
+          <w:ilvl w:val="0"/>
+          <w:numId w:val="2"/>
+        </w:numPr>
+        <w:spacing w:after="80"/>
+      </w:pPr>
+      <w:r>
+        <w:rPr>
+          <w:rFonts w:ascii="Arial" w:cs="Arial" w:eastAsia="Arial" w:hAnsi="Arial"/>
+          <w:sz w:val="22"/>
+          <w:szCs w:val="22"/>
+        </w:rPr>
         <w:t xml:space="preserve">Install essential utilities: curl, git, unzip, software-properties-common</w:t>
+      </w:r>
+    </w:p>
+    <w:p>
+      <w:r>
+        <w:t xml:space="preserve"/>
+      </w:r>
+    </w:p>
+    <w:p>
+      <w:pPr>
+        <w:spacing w:after="120"/>
+        <w:ind w:left="720"/>
+      </w:pPr>
+      <w:r>
+        <w:rPr>
+          <w:rFonts w:ascii="Arial" w:cs="Arial" w:eastAsia="Arial" w:hAnsi="Arial"/>
+          <w:b/>
+          <w:bCs/>
+          <w:color w:val="2E75B6"/>
+          <w:sz w:val="22"/>
+          <w:szCs w:val="22"/>
+        </w:rPr>
+        <w:t xml:space="preserve">Note: </w:t>
+      </w:r>
+      <w:r>
+        <w:rPr>
+          <w:rFonts w:ascii="Arial" w:cs="Arial" w:eastAsia="Arial" w:hAnsi="Arial"/>
+          <w:i/>
+          <w:iCs/>
+          <w:sz w:val="22"/>
+          <w:szCs w:val="22"/>
+        </w:rPr>
+        <w:t xml:space="preserve">All phases after Phase 1 operate as cbmadmin via sudo. The tool must re-establish the SSH connection as cbmadmin after hardening completes.</w:t>
       </w:r>
     </w:p>
     <w:p>
@@ -6499,6 +6639,22 @@
     </w:p>
     <w:p>
       <w:pPr>
+        <w:pStyle w:val="Heading2"/>
+      </w:pPr>
+      <w:r>
+        <w:rPr>
+          <w:rFonts w:ascii="Arial" w:cs="Arial" w:eastAsia="Arial" w:hAnsi="Arial"/>
+          <w:b/>
+          <w:bCs/>
+          <w:color w:val="404040"/>
+          <w:sz w:val="26"/>
+          <w:szCs w:val="26"/>
+        </w:rPr>
+        <w:t xml:space="preserve">7.1 Failure Behavior</w:t>
+      </w:r>
+    </w:p>
+    <w:p>
+      <w:pPr>
         <w:pStyle w:val="ListParagraph"/>
         <w:numPr>
           <w:ilvl w:val="0"/>
@@ -6530,7 +6686,7 @@
           <w:sz w:val="22"/>
           <w:szCs w:val="22"/>
         </w:rPr>
-        <w:t xml:space="preserve">On phase failure, the tool must halt and display a clear error message with remediation guidance where possible</w:t>
+        <w:t xml:space="preserve">On phase failure, the tool halts immediately and displays a clear error message in the UI</w:t>
       </w:r>
     </w:p>
     <w:p>
@@ -6548,7 +6704,7 @@
           <w:sz w:val="22"/>
           <w:szCs w:val="22"/>
         </w:rPr>
-        <w:t xml:space="preserve">The tool must not silently continue past a failed step</w:t>
+        <w:t xml:space="preserve">Where possible, a plain-language remediation suggestion is shown alongside the technical error</w:t>
       </w:r>
     </w:p>
     <w:p>
@@ -6566,7 +6722,7 @@
           <w:sz w:val="22"/>
           <w:szCs w:val="22"/>
         </w:rPr>
-        <w:t xml:space="preserve">SSH connection failures must be reported with actionable guidance (check IP, key path, firewall)</w:t>
+        <w:t xml:space="preserve">SSH connection failures must be reported with actionable guidance (check IP, key path, firewall rules)</w:t>
       </w:r>
     </w:p>
     <w:p>
@@ -6585,6 +6741,547 @@
           <w:szCs w:val="22"/>
         </w:rPr>
         <w:t xml:space="preserve">DNS resolution failure before SSL issuance must display a warning and prompt the user to confirm before attempting anyway or aborting</w:t>
+      </w:r>
+    </w:p>
+    <w:p>
+      <w:r>
+        <w:t xml:space="preserve"/>
+      </w:r>
+    </w:p>
+    <w:p>
+      <w:pPr>
+        <w:pStyle w:val="Heading2"/>
+      </w:pPr>
+      <w:r>
+        <w:rPr>
+          <w:rFonts w:ascii="Arial" w:cs="Arial" w:eastAsia="Arial" w:hAnsi="Arial"/>
+          <w:b/>
+          <w:bCs/>
+          <w:color w:val="404040"/>
+          <w:sz w:val="26"/>
+          <w:szCs w:val="26"/>
+        </w:rPr>
+        <w:t xml:space="preserve">7.2 Cleanup and Restart</w:t>
+      </w:r>
+    </w:p>
+    <w:p>
+      <w:pPr>
+        <w:spacing w:after="120"/>
+      </w:pPr>
+      <w:r>
+        <w:rPr>
+          <w:rFonts w:ascii="Arial" w:cs="Arial" w:eastAsia="Arial" w:hAnsi="Arial"/>
+          <w:sz w:val="22"/>
+          <w:szCs w:val="22"/>
+        </w:rPr>
+        <w:t xml:space="preserve">When a phase fails, the tool must:</w:t>
+      </w:r>
+    </w:p>
+    <w:p>
+      <w:pPr>
+        <w:pStyle w:val="ListParagraph"/>
+        <w:numPr>
+          <w:ilvl w:val="0"/>
+          <w:numId w:val="3"/>
+        </w:numPr>
+        <w:spacing w:after="80"/>
+      </w:pPr>
+      <w:r>
+        <w:rPr>
+          <w:rFonts w:ascii="Arial" w:cs="Arial" w:eastAsia="Arial" w:hAnsi="Arial"/>
+          <w:sz w:val="22"/>
+          <w:szCs w:val="22"/>
+        </w:rPr>
+        <w:t xml:space="preserve">Halt deployment immediately at the point of failure</w:t>
+      </w:r>
+    </w:p>
+    <w:p>
+      <w:pPr>
+        <w:pStyle w:val="ListParagraph"/>
+        <w:numPr>
+          <w:ilvl w:val="0"/>
+          <w:numId w:val="3"/>
+        </w:numPr>
+        <w:spacing w:after="80"/>
+      </w:pPr>
+      <w:r>
+        <w:rPr>
+          <w:rFonts w:ascii="Arial" w:cs="Arial" w:eastAsia="Arial" w:hAnsi="Arial"/>
+          <w:sz w:val="22"/>
+          <w:szCs w:val="22"/>
+        </w:rPr>
+        <w:t xml:space="preserve">Execute a cleanup sequence to remove any partially installed components from the failed phase</w:t>
+      </w:r>
+    </w:p>
+    <w:p>
+      <w:pPr>
+        <w:pStyle w:val="ListParagraph"/>
+        <w:numPr>
+          <w:ilvl w:val="0"/>
+          <w:numId w:val="3"/>
+        </w:numPr>
+        <w:spacing w:after="80"/>
+      </w:pPr>
+      <w:r>
+        <w:rPr>
+          <w:rFonts w:ascii="Arial" w:cs="Arial" w:eastAsia="Arial" w:hAnsi="Arial"/>
+          <w:sz w:val="22"/>
+          <w:szCs w:val="22"/>
+        </w:rPr>
+        <w:t xml:space="preserve">Report cleanup status clearly in the log window (each cleanup step shown as it runs)</w:t>
+      </w:r>
+    </w:p>
+    <w:p>
+      <w:pPr>
+        <w:pStyle w:val="ListParagraph"/>
+        <w:numPr>
+          <w:ilvl w:val="0"/>
+          <w:numId w:val="3"/>
+        </w:numPr>
+        <w:spacing w:after="80"/>
+      </w:pPr>
+      <w:r>
+        <w:rPr>
+          <w:rFonts w:ascii="Arial" w:cs="Arial" w:eastAsia="Arial" w:hAnsi="Arial"/>
+          <w:sz w:val="22"/>
+          <w:szCs w:val="22"/>
+        </w:rPr>
+        <w:t xml:space="preserve">Return the server to a clean state equivalent to the start of Phase 1</w:t>
+      </w:r>
+    </w:p>
+    <w:p>
+      <w:pPr>
+        <w:pStyle w:val="ListParagraph"/>
+        <w:numPr>
+          <w:ilvl w:val="0"/>
+          <w:numId w:val="3"/>
+        </w:numPr>
+        <w:spacing w:after="80"/>
+      </w:pPr>
+      <w:r>
+        <w:rPr>
+          <w:rFonts w:ascii="Arial" w:cs="Arial" w:eastAsia="Arial" w:hAnsi="Arial"/>
+          <w:sz w:val="22"/>
+          <w:szCs w:val="22"/>
+        </w:rPr>
+        <w:t xml:space="preserve">Present a Restart Deployment button in the UI to re-run from Phase 1</w:t>
+      </w:r>
+    </w:p>
+    <w:p>
+      <w:r>
+        <w:t xml:space="preserve"/>
+      </w:r>
+    </w:p>
+    <w:p>
+      <w:pPr>
+        <w:spacing w:after="120"/>
+      </w:pPr>
+      <w:r>
+        <w:rPr>
+          <w:rFonts w:ascii="Arial" w:cs="Arial" w:eastAsia="Arial" w:hAnsi="Arial"/>
+          <w:sz w:val="22"/>
+          <w:szCs w:val="22"/>
+        </w:rPr>
+        <w:t xml:space="preserve">Cleanup actions per phase:</w:t>
+      </w:r>
+    </w:p>
+    <w:p>
+      <w:r>
+        <w:t xml:space="preserve"/>
+      </w:r>
+    </w:p>
+    <w:tbl>
+      <w:tblPr>
+        <w:tblW w:type="dxa" w:w="9360"/>
+        <w:tblBorders>
+          <w:top w:val="single" w:color="auto" w:sz="4"/>
+          <w:left w:val="single" w:color="auto" w:sz="4"/>
+          <w:bottom w:val="single" w:color="auto" w:sz="4"/>
+          <w:right w:val="single" w:color="auto" w:sz="4"/>
+          <w:insideH w:val="single" w:color="auto" w:sz="4"/>
+          <w:insideV w:val="single" w:color="auto" w:sz="4"/>
+        </w:tblBorders>
+      </w:tblPr>
+      <w:tblGrid>
+        <w:gridCol w:w="2500"/>
+        <w:gridCol w:w="6860"/>
+      </w:tblGrid>
+      <w:tr>
+        <w:trPr>
+          <w:tblHeader/>
+        </w:trPr>
+        <w:tc>
+          <w:tcPr>
+            <w:tcW w:type="dxa" w:w="2500"/>
+            <w:tcBorders>
+              <w:top w:val="single" w:color="CCCCCC" w:sz="1"/>
+              <w:left w:val="single" w:color="CCCCCC" w:sz="1"/>
+              <w:bottom w:val="single" w:color="CCCCCC" w:sz="1"/>
+              <w:right w:val="single" w:color="CCCCCC" w:sz="1"/>
+            </w:tcBorders>
+            <w:shd w:fill="D5E8F0" w:val="clear"/>
+            <w:tcMar>
+              <w:top w:type="dxa" w:w="80"/>
+              <w:left w:type="dxa" w:w="120"/>
+              <w:bottom w:type="dxa" w:w="80"/>
+              <w:right w:type="dxa" w:w="120"/>
+            </w:tcMar>
+          </w:tcPr>
+          <w:p>
+            <w:r>
+              <w:rPr>
+                <w:rFonts w:ascii="Arial" w:cs="Arial" w:eastAsia="Arial" w:hAnsi="Arial"/>
+                <w:b/>
+                <w:bCs/>
+                <w:sz w:val="20"/>
+                <w:szCs w:val="20"/>
+              </w:rPr>
+              <w:t xml:space="preserve">Phase</w:t>
+            </w:r>
+          </w:p>
+        </w:tc>
+        <w:tc>
+          <w:tcPr>
+            <w:tcW w:type="dxa" w:w="6860"/>
+            <w:tcBorders>
+              <w:top w:val="single" w:color="CCCCCC" w:sz="1"/>
+              <w:left w:val="single" w:color="CCCCCC" w:sz="1"/>
+              <w:bottom w:val="single" w:color="CCCCCC" w:sz="1"/>
+              <w:right w:val="single" w:color="CCCCCC" w:sz="1"/>
+            </w:tcBorders>
+            <w:shd w:fill="D5E8F0" w:val="clear"/>
+            <w:tcMar>
+              <w:top w:type="dxa" w:w="80"/>
+              <w:left w:type="dxa" w:w="120"/>
+              <w:bottom w:type="dxa" w:w="80"/>
+              <w:right w:type="dxa" w:w="120"/>
+            </w:tcMar>
+          </w:tcPr>
+          <w:p>
+            <w:r>
+              <w:rPr>
+                <w:rFonts w:ascii="Arial" w:cs="Arial" w:eastAsia="Arial" w:hAnsi="Arial"/>
+                <w:b/>
+                <w:bCs/>
+                <w:sz w:val="20"/>
+                <w:szCs w:val="20"/>
+              </w:rPr>
+              <w:t xml:space="preserve">Cleanup Actions</w:t>
+            </w:r>
+          </w:p>
+        </w:tc>
+      </w:tr>
+      <w:tr>
+        <w:tc>
+          <w:tcPr>
+            <w:tcW w:type="dxa" w:w="2500"/>
+            <w:tcBorders>
+              <w:top w:val="single" w:color="CCCCCC" w:sz="1"/>
+              <w:left w:val="single" w:color="CCCCCC" w:sz="1"/>
+              <w:bottom w:val="single" w:color="CCCCCC" w:sz="1"/>
+              <w:right w:val="single" w:color="CCCCCC" w:sz="1"/>
+            </w:tcBorders>
+            <w:tcMar>
+              <w:top w:type="dxa" w:w="80"/>
+              <w:left w:type="dxa" w:w="120"/>
+              <w:bottom w:type="dxa" w:w="80"/>
+              <w:right w:type="dxa" w:w="120"/>
+            </w:tcMar>
+          </w:tcPr>
+          <w:p>
+            <w:r>
+              <w:rPr>
+                <w:rFonts w:ascii="Arial" w:cs="Arial" w:eastAsia="Arial" w:hAnsi="Arial"/>
+                <w:sz w:val="20"/>
+                <w:szCs w:val="20"/>
+              </w:rPr>
+              <w:t xml:space="preserve">Phase 1 — Hardening</w:t>
+            </w:r>
+          </w:p>
+        </w:tc>
+        <w:tc>
+          <w:tcPr>
+            <w:tcW w:type="dxa" w:w="6860"/>
+            <w:tcBorders>
+              <w:top w:val="single" w:color="CCCCCC" w:sz="1"/>
+              <w:left w:val="single" w:color="CCCCCC" w:sz="1"/>
+              <w:bottom w:val="single" w:color="CCCCCC" w:sz="1"/>
+              <w:right w:val="single" w:color="CCCCCC" w:sz="1"/>
+            </w:tcBorders>
+            <w:tcMar>
+              <w:top w:type="dxa" w:w="80"/>
+              <w:left w:type="dxa" w:w="120"/>
+              <w:bottom w:type="dxa" w:w="80"/>
+              <w:right w:type="dxa" w:w="120"/>
+            </w:tcMar>
+          </w:tcPr>
+          <w:p>
+            <w:r>
+              <w:rPr>
+                <w:rFonts w:ascii="Arial" w:cs="Arial" w:eastAsia="Arial" w:hAnsi="Arial"/>
+                <w:sz w:val="20"/>
+                <w:szCs w:val="20"/>
+              </w:rPr>
+              <w:t xml:space="preserve">Remove cbmadmin user if created; restore sshd_config to original; restart SSH</w:t>
+            </w:r>
+          </w:p>
+        </w:tc>
+      </w:tr>
+      <w:tr>
+        <w:tc>
+          <w:tcPr>
+            <w:tcW w:type="dxa" w:w="2500"/>
+            <w:tcBorders>
+              <w:top w:val="single" w:color="CCCCCC" w:sz="1"/>
+              <w:left w:val="single" w:color="CCCCCC" w:sz="1"/>
+              <w:bottom w:val="single" w:color="CCCCCC" w:sz="1"/>
+              <w:right w:val="single" w:color="CCCCCC" w:sz="1"/>
+            </w:tcBorders>
+            <w:tcMar>
+              <w:top w:type="dxa" w:w="80"/>
+              <w:left w:type="dxa" w:w="120"/>
+              <w:bottom w:type="dxa" w:w="80"/>
+              <w:right w:type="dxa" w:w="120"/>
+            </w:tcMar>
+          </w:tcPr>
+          <w:p>
+            <w:r>
+              <w:rPr>
+                <w:rFonts w:ascii="Arial" w:cs="Arial" w:eastAsia="Arial" w:hAnsi="Arial"/>
+                <w:sz w:val="20"/>
+                <w:szCs w:val="20"/>
+              </w:rPr>
+              <w:t xml:space="preserve">Phase 2 — Stack</w:t>
+            </w:r>
+          </w:p>
+        </w:tc>
+        <w:tc>
+          <w:tcPr>
+            <w:tcW w:type="dxa" w:w="6860"/>
+            <w:tcBorders>
+              <w:top w:val="single" w:color="CCCCCC" w:sz="1"/>
+              <w:left w:val="single" w:color="CCCCCC" w:sz="1"/>
+              <w:bottom w:val="single" w:color="CCCCCC" w:sz="1"/>
+              <w:right w:val="single" w:color="CCCCCC" w:sz="1"/>
+            </w:tcBorders>
+            <w:tcMar>
+              <w:top w:type="dxa" w:w="80"/>
+              <w:left w:type="dxa" w:w="120"/>
+              <w:bottom w:type="dxa" w:w="80"/>
+              <w:right w:type="dxa" w:w="120"/>
+            </w:tcMar>
+          </w:tcPr>
+          <w:p>
+            <w:r>
+              <w:rPr>
+                <w:rFonts w:ascii="Arial" w:cs="Arial" w:eastAsia="Arial" w:hAnsi="Arial"/>
+                <w:sz w:val="20"/>
+                <w:szCs w:val="20"/>
+              </w:rPr>
+              <w:t xml:space="preserve">Purge nginx, php8.2, mysql-server packages; remove associated config files and data directories</w:t>
+            </w:r>
+          </w:p>
+        </w:tc>
+      </w:tr>
+      <w:tr>
+        <w:tc>
+          <w:tcPr>
+            <w:tcW w:type="dxa" w:w="2500"/>
+            <w:tcBorders>
+              <w:top w:val="single" w:color="CCCCCC" w:sz="1"/>
+              <w:left w:val="single" w:color="CCCCCC" w:sz="1"/>
+              <w:bottom w:val="single" w:color="CCCCCC" w:sz="1"/>
+              <w:right w:val="single" w:color="CCCCCC" w:sz="1"/>
+            </w:tcBorders>
+            <w:tcMar>
+              <w:top w:type="dxa" w:w="80"/>
+              <w:left w:type="dxa" w:w="120"/>
+              <w:bottom w:type="dxa" w:w="80"/>
+              <w:right w:type="dxa" w:w="120"/>
+            </w:tcMar>
+          </w:tcPr>
+          <w:p>
+            <w:r>
+              <w:rPr>
+                <w:rFonts w:ascii="Arial" w:cs="Arial" w:eastAsia="Arial" w:hAnsi="Arial"/>
+                <w:sz w:val="20"/>
+                <w:szCs w:val="20"/>
+              </w:rPr>
+              <w:t xml:space="preserve">Phase 3 — EspoCRM</w:t>
+            </w:r>
+          </w:p>
+        </w:tc>
+        <w:tc>
+          <w:tcPr>
+            <w:tcW w:type="dxa" w:w="6860"/>
+            <w:tcBorders>
+              <w:top w:val="single" w:color="CCCCCC" w:sz="1"/>
+              <w:left w:val="single" w:color="CCCCCC" w:sz="1"/>
+              <w:bottom w:val="single" w:color="CCCCCC" w:sz="1"/>
+              <w:right w:val="single" w:color="CCCCCC" w:sz="1"/>
+            </w:tcBorders>
+            <w:tcMar>
+              <w:top w:type="dxa" w:w="80"/>
+              <w:left w:type="dxa" w:w="120"/>
+              <w:bottom w:type="dxa" w:w="80"/>
+              <w:right w:type="dxa" w:w="120"/>
+            </w:tcMar>
+          </w:tcPr>
+          <w:p>
+            <w:r>
+              <w:rPr>
+                <w:rFonts w:ascii="Arial" w:cs="Arial" w:eastAsia="Arial" w:hAnsi="Arial"/>
+                <w:sz w:val="20"/>
+                <w:szCs w:val="20"/>
+              </w:rPr>
+              <w:t xml:space="preserve">Remove /var/www/espocrm; remove Nginx virtual host config; drop EspoCRM database and user</w:t>
+            </w:r>
+          </w:p>
+        </w:tc>
+      </w:tr>
+      <w:tr>
+        <w:tc>
+          <w:tcPr>
+            <w:tcW w:type="dxa" w:w="2500"/>
+            <w:tcBorders>
+              <w:top w:val="single" w:color="CCCCCC" w:sz="1"/>
+              <w:left w:val="single" w:color="CCCCCC" w:sz="1"/>
+              <w:bottom w:val="single" w:color="CCCCCC" w:sz="1"/>
+              <w:right w:val="single" w:color="CCCCCC" w:sz="1"/>
+            </w:tcBorders>
+            <w:tcMar>
+              <w:top w:type="dxa" w:w="80"/>
+              <w:left w:type="dxa" w:w="120"/>
+              <w:bottom w:type="dxa" w:w="80"/>
+              <w:right w:type="dxa" w:w="120"/>
+            </w:tcMar>
+          </w:tcPr>
+          <w:p>
+            <w:r>
+              <w:rPr>
+                <w:rFonts w:ascii="Arial" w:cs="Arial" w:eastAsia="Arial" w:hAnsi="Arial"/>
+                <w:sz w:val="20"/>
+                <w:szCs w:val="20"/>
+              </w:rPr>
+              <w:t xml:space="preserve">Phase 4 — SSL</w:t>
+            </w:r>
+          </w:p>
+        </w:tc>
+        <w:tc>
+          <w:tcPr>
+            <w:tcW w:type="dxa" w:w="6860"/>
+            <w:tcBorders>
+              <w:top w:val="single" w:color="CCCCCC" w:sz="1"/>
+              <w:left w:val="single" w:color="CCCCCC" w:sz="1"/>
+              <w:bottom w:val="single" w:color="CCCCCC" w:sz="1"/>
+              <w:right w:val="single" w:color="CCCCCC" w:sz="1"/>
+            </w:tcBorders>
+            <w:tcMar>
+              <w:top w:type="dxa" w:w="80"/>
+              <w:left w:type="dxa" w:w="120"/>
+              <w:bottom w:type="dxa" w:w="80"/>
+              <w:right w:type="dxa" w:w="120"/>
+            </w:tcMar>
+          </w:tcPr>
+          <w:p>
+            <w:r>
+              <w:rPr>
+                <w:rFonts w:ascii="Arial" w:cs="Arial" w:eastAsia="Arial" w:hAnsi="Arial"/>
+                <w:sz w:val="20"/>
+                <w:szCs w:val="20"/>
+              </w:rPr>
+              <w:t xml:space="preserve">Revoke and delete Let's Encrypt certificate; remove HTTPS Nginx config; restore HTTP-only config</w:t>
+            </w:r>
+          </w:p>
+        </w:tc>
+      </w:tr>
+      <w:tr>
+        <w:tc>
+          <w:tcPr>
+            <w:tcW w:type="dxa" w:w="2500"/>
+            <w:tcBorders>
+              <w:top w:val="single" w:color="CCCCCC" w:sz="1"/>
+              <w:left w:val="single" w:color="CCCCCC" w:sz="1"/>
+              <w:bottom w:val="single" w:color="CCCCCC" w:sz="1"/>
+              <w:right w:val="single" w:color="CCCCCC" w:sz="1"/>
+            </w:tcBorders>
+            <w:tcMar>
+              <w:top w:type="dxa" w:w="80"/>
+              <w:left w:type="dxa" w:w="120"/>
+              <w:bottom w:type="dxa" w:w="80"/>
+              <w:right w:type="dxa" w:w="120"/>
+            </w:tcMar>
+          </w:tcPr>
+          <w:p>
+            <w:r>
+              <w:rPr>
+                <w:rFonts w:ascii="Arial" w:cs="Arial" w:eastAsia="Arial" w:hAnsi="Arial"/>
+                <w:sz w:val="20"/>
+                <w:szCs w:val="20"/>
+              </w:rPr>
+              <w:t xml:space="preserve">Phase 5 — Verify</w:t>
+            </w:r>
+          </w:p>
+        </w:tc>
+        <w:tc>
+          <w:tcPr>
+            <w:tcW w:type="dxa" w:w="6860"/>
+            <w:tcBorders>
+              <w:top w:val="single" w:color="CCCCCC" w:sz="1"/>
+              <w:left w:val="single" w:color="CCCCCC" w:sz="1"/>
+              <w:bottom w:val="single" w:color="CCCCCC" w:sz="1"/>
+              <w:right w:val="single" w:color="CCCCCC" w:sz="1"/>
+            </w:tcBorders>
+            <w:tcMar>
+              <w:top w:type="dxa" w:w="80"/>
+              <w:left w:type="dxa" w:w="120"/>
+              <w:bottom w:type="dxa" w:w="80"/>
+              <w:right w:type="dxa" w:w="120"/>
+            </w:tcMar>
+          </w:tcPr>
+          <w:p>
+            <w:r>
+              <w:rPr>
+                <w:rFonts w:ascii="Arial" w:cs="Arial" w:eastAsia="Arial" w:hAnsi="Arial"/>
+                <w:sz w:val="20"/>
+                <w:szCs w:val="20"/>
+              </w:rPr>
+              <w:t xml:space="preserve">No cleanup required (verification is read-only)</w:t>
+            </w:r>
+          </w:p>
+        </w:tc>
+      </w:tr>
+    </w:tbl>
+    <w:p>
+      <w:r>
+        <w:t xml:space="preserve"/>
+      </w:r>
+    </w:p>
+    <w:p>
+      <w:pPr>
+        <w:spacing w:after="120"/>
+        <w:ind w:left="720"/>
+      </w:pPr>
+      <w:r>
+        <w:rPr>
+          <w:rFonts w:ascii="Arial" w:cs="Arial" w:eastAsia="Arial" w:hAnsi="Arial"/>
+          <w:b/>
+          <w:bCs/>
+          <w:color w:val="2E75B6"/>
+          <w:sz w:val="22"/>
+          <w:szCs w:val="22"/>
+        </w:rPr>
+        <w:t xml:space="preserve">Note: </w:t>
+      </w:r>
+      <w:r>
+        <w:rPr>
+          <w:rFonts w:ascii="Arial" w:cs="Arial" w:eastAsia="Arial" w:hAnsi="Arial"/>
+          <w:i/>
+          <w:iCs/>
+          <w:sz w:val="22"/>
+          <w:szCs w:val="22"/>
+        </w:rPr>
+        <w:t xml:space="preserve">Cleanup is best-effort. If a cleanup step itself fails, the tool logs the failure and continues with remaining cleanup steps rather than halting. The user is notified of any cleanup steps that could not be completed.</w:t>
       </w:r>
     </w:p>
     <w:p>
@@ -7745,8 +8442,9 @@
       </w:tblPr>
       <w:tblGrid>
         <w:gridCol w:w="360"/>
-        <w:gridCol w:w="6000"/>
-        <w:gridCol w:w="2000"/>
+        <w:gridCol w:w="3200"/>
+        <w:gridCol w:w="1000"/>
+        <w:gridCol w:w="3800"/>
       </w:tblGrid>
       <w:tr>
         <w:trPr>
@@ -7784,7 +8482,7 @@
         </w:tc>
         <w:tc>
           <w:tcPr>
-            <w:tcW w:type="dxa" w:w="6000"/>
+            <w:tcW w:type="dxa" w:w="3200"/>
             <w:tcBorders>
               <w:top w:val="single" w:color="CCCCCC" w:sz="1"/>
               <w:left w:val="single" w:color="CCCCCC" w:sz="1"/>
@@ -7814,7 +8512,7 @@
         </w:tc>
         <w:tc>
           <w:tcPr>
-            <w:tcW w:type="dxa" w:w="2000"/>
+            <w:tcW w:type="dxa" w:w="1000"/>
             <w:tcBorders>
               <w:top w:val="single" w:color="CCCCCC" w:sz="1"/>
               <w:left w:val="single" w:color="CCCCCC" w:sz="1"/>
@@ -7842,6 +8540,36 @@
             </w:r>
           </w:p>
         </w:tc>
+        <w:tc>
+          <w:tcPr>
+            <w:tcW w:type="dxa" w:w="3800"/>
+            <w:tcBorders>
+              <w:top w:val="single" w:color="CCCCCC" w:sz="1"/>
+              <w:left w:val="single" w:color="CCCCCC" w:sz="1"/>
+              <w:bottom w:val="single" w:color="CCCCCC" w:sz="1"/>
+              <w:right w:val="single" w:color="CCCCCC" w:sz="1"/>
+            </w:tcBorders>
+            <w:shd w:fill="D5E8F0" w:val="clear"/>
+            <w:tcMar>
+              <w:top w:type="dxa" w:w="80"/>
+              <w:left w:type="dxa" w:w="120"/>
+              <w:bottom w:type="dxa" w:w="80"/>
+              <w:right w:type="dxa" w:w="120"/>
+            </w:tcMar>
+          </w:tcPr>
+          <w:p>
+            <w:r>
+              <w:rPr>
+                <w:rFonts w:ascii="Arial" w:cs="Arial" w:eastAsia="Arial" w:hAnsi="Arial"/>
+                <w:b/>
+                <w:bCs/>
+                <w:sz w:val="20"/>
+                <w:szCs w:val="20"/>
+              </w:rPr>
+              <w:t xml:space="preserve">Decision</w:t>
+            </w:r>
+          </w:p>
+        </w:tc>
       </w:tr>
       <w:tr>
         <w:tc>
@@ -7873,55 +8601,82 @@
         </w:tc>
         <w:tc>
           <w:tcPr>
-            <w:tcW w:type="dxa" w:w="6000"/>
-            <w:tcBorders>
-              <w:top w:val="single" w:color="CCCCCC" w:sz="1"/>
-              <w:left w:val="single" w:color="CCCCCC" w:sz="1"/>
-              <w:bottom w:val="single" w:color="CCCCCC" w:sz="1"/>
-              <w:right w:val="single" w:color="CCCCCC" w:sz="1"/>
-            </w:tcBorders>
-            <w:tcMar>
-              <w:top w:type="dxa" w:w="80"/>
-              <w:left w:type="dxa" w:w="120"/>
-              <w:bottom w:type="dxa" w:w="80"/>
-              <w:right w:type="dxa" w:w="120"/>
-            </w:tcMar>
-          </w:tcPr>
-          <w:p>
-            <w:r>
-              <w:rPr>
-                <w:rFonts w:ascii="Arial" w:cs="Arial" w:eastAsia="Arial" w:hAnsi="Arial"/>
-                <w:sz w:val="20"/>
-                <w:szCs w:val="20"/>
-              </w:rPr>
-              <w:t xml:space="preserve">Should the tool support resuming a failed deployment from the last completed phase, or always restart from phase 1?</w:t>
-            </w:r>
-          </w:p>
-        </w:tc>
-        <w:tc>
-          <w:tcPr>
-            <w:tcW w:type="dxa" w:w="2000"/>
-            <w:tcBorders>
-              <w:top w:val="single" w:color="CCCCCC" w:sz="1"/>
-              <w:left w:val="single" w:color="CCCCCC" w:sz="1"/>
-              <w:bottom w:val="single" w:color="CCCCCC" w:sz="1"/>
-              <w:right w:val="single" w:color="CCCCCC" w:sz="1"/>
-            </w:tcBorders>
-            <w:tcMar>
-              <w:top w:type="dxa" w:w="80"/>
-              <w:left w:type="dxa" w:w="120"/>
-              <w:bottom w:type="dxa" w:w="80"/>
-              <w:right w:type="dxa" w:w="120"/>
-            </w:tcMar>
-          </w:tcPr>
-          <w:p>
-            <w:r>
-              <w:rPr>
-                <w:rFonts w:ascii="Arial" w:cs="Arial" w:eastAsia="Arial" w:hAnsi="Arial"/>
-                <w:sz w:val="20"/>
-                <w:szCs w:val="20"/>
-              </w:rPr>
-              <w:t xml:space="preserve">Open</w:t>
+            <w:tcW w:type="dxa" w:w="3200"/>
+            <w:tcBorders>
+              <w:top w:val="single" w:color="CCCCCC" w:sz="1"/>
+              <w:left w:val="single" w:color="CCCCCC" w:sz="1"/>
+              <w:bottom w:val="single" w:color="CCCCCC" w:sz="1"/>
+              <w:right w:val="single" w:color="CCCCCC" w:sz="1"/>
+            </w:tcBorders>
+            <w:tcMar>
+              <w:top w:type="dxa" w:w="80"/>
+              <w:left w:type="dxa" w:w="120"/>
+              <w:bottom w:type="dxa" w:w="80"/>
+              <w:right w:type="dxa" w:w="120"/>
+            </w:tcMar>
+          </w:tcPr>
+          <w:p>
+            <w:r>
+              <w:rPr>
+                <w:rFonts w:ascii="Arial" w:cs="Arial" w:eastAsia="Arial" w:hAnsi="Arial"/>
+                <w:sz w:val="20"/>
+                <w:szCs w:val="20"/>
+              </w:rPr>
+              <w:t xml:space="preserve">Should the tool support resuming from the last completed phase, or always restart from Phase 1?</w:t>
+            </w:r>
+          </w:p>
+        </w:tc>
+        <w:tc>
+          <w:tcPr>
+            <w:tcW w:type="dxa" w:w="1000"/>
+            <w:tcBorders>
+              <w:top w:val="single" w:color="CCCCCC" w:sz="1"/>
+              <w:left w:val="single" w:color="CCCCCC" w:sz="1"/>
+              <w:bottom w:val="single" w:color="CCCCCC" w:sz="1"/>
+              <w:right w:val="single" w:color="CCCCCC" w:sz="1"/>
+            </w:tcBorders>
+            <w:tcMar>
+              <w:top w:type="dxa" w:w="80"/>
+              <w:left w:type="dxa" w:w="120"/>
+              <w:bottom w:type="dxa" w:w="80"/>
+              <w:right w:type="dxa" w:w="120"/>
+            </w:tcMar>
+          </w:tcPr>
+          <w:p>
+            <w:r>
+              <w:rPr>
+                <w:rFonts w:ascii="Arial" w:cs="Arial" w:eastAsia="Arial" w:hAnsi="Arial"/>
+                <w:sz w:val="20"/>
+                <w:szCs w:val="20"/>
+              </w:rPr>
+              <w:t xml:space="preserve">Closed</w:t>
+            </w:r>
+          </w:p>
+        </w:tc>
+        <w:tc>
+          <w:tcPr>
+            <w:tcW w:type="dxa" w:w="3800"/>
+            <w:tcBorders>
+              <w:top w:val="single" w:color="CCCCCC" w:sz="1"/>
+              <w:left w:val="single" w:color="CCCCCC" w:sz="1"/>
+              <w:bottom w:val="single" w:color="CCCCCC" w:sz="1"/>
+              <w:right w:val="single" w:color="CCCCCC" w:sz="1"/>
+            </w:tcBorders>
+            <w:tcMar>
+              <w:top w:type="dxa" w:w="80"/>
+              <w:left w:type="dxa" w:w="120"/>
+              <w:bottom w:type="dxa" w:w="80"/>
+              <w:right w:type="dxa" w:w="120"/>
+            </w:tcMar>
+          </w:tcPr>
+          <w:p>
+            <w:r>
+              <w:rPr>
+                <w:rFonts w:ascii="Arial" w:cs="Arial" w:eastAsia="Arial" w:hAnsi="Arial"/>
+                <w:sz w:val="20"/>
+                <w:szCs w:val="20"/>
+              </w:rPr>
+              <w:t xml:space="preserve">On failure: cleanup failed phase, restart from Phase 1</w:t>
             </w:r>
           </w:p>
         </w:tc>
@@ -7956,55 +8711,82 @@
         </w:tc>
         <w:tc>
           <w:tcPr>
-            <w:tcW w:type="dxa" w:w="6000"/>
-            <w:tcBorders>
-              <w:top w:val="single" w:color="CCCCCC" w:sz="1"/>
-              <w:left w:val="single" w:color="CCCCCC" w:sz="1"/>
-              <w:bottom w:val="single" w:color="CCCCCC" w:sz="1"/>
-              <w:right w:val="single" w:color="CCCCCC" w:sz="1"/>
-            </w:tcBorders>
-            <w:tcMar>
-              <w:top w:type="dxa" w:w="80"/>
-              <w:left w:type="dxa" w:w="120"/>
-              <w:bottom w:type="dxa" w:w="80"/>
-              <w:right w:type="dxa" w:w="120"/>
-            </w:tcMar>
-          </w:tcPr>
-          <w:p>
-            <w:r>
-              <w:rPr>
-                <w:rFonts w:ascii="Arial" w:cs="Arial" w:eastAsia="Arial" w:hAnsi="Arial"/>
-                <w:sz w:val="20"/>
-                <w:szCs w:val="20"/>
-              </w:rPr>
-              <w:t xml:space="preserve">Should the tool create a non-root sudo user during server hardening, or continue operating as root?</w:t>
-            </w:r>
-          </w:p>
-        </w:tc>
-        <w:tc>
-          <w:tcPr>
-            <w:tcW w:type="dxa" w:w="2000"/>
-            <w:tcBorders>
-              <w:top w:val="single" w:color="CCCCCC" w:sz="1"/>
-              <w:left w:val="single" w:color="CCCCCC" w:sz="1"/>
-              <w:bottom w:val="single" w:color="CCCCCC" w:sz="1"/>
-              <w:right w:val="single" w:color="CCCCCC" w:sz="1"/>
-            </w:tcBorders>
-            <w:tcMar>
-              <w:top w:type="dxa" w:w="80"/>
-              <w:left w:type="dxa" w:w="120"/>
-              <w:bottom w:type="dxa" w:w="80"/>
-              <w:right w:type="dxa" w:w="120"/>
-            </w:tcMar>
-          </w:tcPr>
-          <w:p>
-            <w:r>
-              <w:rPr>
-                <w:rFonts w:ascii="Arial" w:cs="Arial" w:eastAsia="Arial" w:hAnsi="Arial"/>
-                <w:sz w:val="20"/>
-                <w:szCs w:val="20"/>
-              </w:rPr>
-              <w:t xml:space="preserve">Open</w:t>
+            <w:tcW w:type="dxa" w:w="3200"/>
+            <w:tcBorders>
+              <w:top w:val="single" w:color="CCCCCC" w:sz="1"/>
+              <w:left w:val="single" w:color="CCCCCC" w:sz="1"/>
+              <w:bottom w:val="single" w:color="CCCCCC" w:sz="1"/>
+              <w:right w:val="single" w:color="CCCCCC" w:sz="1"/>
+            </w:tcBorders>
+            <w:tcMar>
+              <w:top w:type="dxa" w:w="80"/>
+              <w:left w:type="dxa" w:w="120"/>
+              <w:bottom w:type="dxa" w:w="80"/>
+              <w:right w:type="dxa" w:w="120"/>
+            </w:tcMar>
+          </w:tcPr>
+          <w:p>
+            <w:r>
+              <w:rPr>
+                <w:rFonts w:ascii="Arial" w:cs="Arial" w:eastAsia="Arial" w:hAnsi="Arial"/>
+                <w:sz w:val="20"/>
+                <w:szCs w:val="20"/>
+              </w:rPr>
+              <w:t xml:space="preserve">Should the tool create a non-root sudo user during server hardening?</w:t>
+            </w:r>
+          </w:p>
+        </w:tc>
+        <w:tc>
+          <w:tcPr>
+            <w:tcW w:type="dxa" w:w="1000"/>
+            <w:tcBorders>
+              <w:top w:val="single" w:color="CCCCCC" w:sz="1"/>
+              <w:left w:val="single" w:color="CCCCCC" w:sz="1"/>
+              <w:bottom w:val="single" w:color="CCCCCC" w:sz="1"/>
+              <w:right w:val="single" w:color="CCCCCC" w:sz="1"/>
+            </w:tcBorders>
+            <w:tcMar>
+              <w:top w:type="dxa" w:w="80"/>
+              <w:left w:type="dxa" w:w="120"/>
+              <w:bottom w:type="dxa" w:w="80"/>
+              <w:right w:type="dxa" w:w="120"/>
+            </w:tcMar>
+          </w:tcPr>
+          <w:p>
+            <w:r>
+              <w:rPr>
+                <w:rFonts w:ascii="Arial" w:cs="Arial" w:eastAsia="Arial" w:hAnsi="Arial"/>
+                <w:sz w:val="20"/>
+                <w:szCs w:val="20"/>
+              </w:rPr>
+              <w:t xml:space="preserve">Closed</w:t>
+            </w:r>
+          </w:p>
+        </w:tc>
+        <w:tc>
+          <w:tcPr>
+            <w:tcW w:type="dxa" w:w="3800"/>
+            <w:tcBorders>
+              <w:top w:val="single" w:color="CCCCCC" w:sz="1"/>
+              <w:left w:val="single" w:color="CCCCCC" w:sz="1"/>
+              <w:bottom w:val="single" w:color="CCCCCC" w:sz="1"/>
+              <w:right w:val="single" w:color="CCCCCC" w:sz="1"/>
+            </w:tcBorders>
+            <w:tcMar>
+              <w:top w:type="dxa" w:w="80"/>
+              <w:left w:type="dxa" w:w="120"/>
+              <w:bottom w:type="dxa" w:w="80"/>
+              <w:right w:type="dxa" w:w="120"/>
+            </w:tcMar>
+          </w:tcPr>
+          <w:p>
+            <w:r>
+              <w:rPr>
+                <w:rFonts w:ascii="Arial" w:cs="Arial" w:eastAsia="Arial" w:hAnsi="Arial"/>
+                <w:sz w:val="20"/>
+                <w:szCs w:val="20"/>
+              </w:rPr>
+              <w:t xml:space="preserve">Yes — create cbmadmin user in Phase 1; all subsequent phases run as cbmadmin</w:t>
             </w:r>
           </w:p>
         </w:tc>
@@ -8039,55 +8821,82 @@
         </w:tc>
         <w:tc>
           <w:tcPr>
-            <w:tcW w:type="dxa" w:w="6000"/>
-            <w:tcBorders>
-              <w:top w:val="single" w:color="CCCCCC" w:sz="1"/>
-              <w:left w:val="single" w:color="CCCCCC" w:sz="1"/>
-              <w:bottom w:val="single" w:color="CCCCCC" w:sz="1"/>
-              <w:right w:val="single" w:color="CCCCCC" w:sz="1"/>
-            </w:tcBorders>
-            <w:tcMar>
-              <w:top w:type="dxa" w:w="80"/>
-              <w:left w:type="dxa" w:w="120"/>
-              <w:bottom w:type="dxa" w:w="80"/>
-              <w:right w:type="dxa" w:w="120"/>
-            </w:tcMar>
-          </w:tcPr>
-          <w:p>
-            <w:r>
-              <w:rPr>
-                <w:rFonts w:ascii="Arial" w:cs="Arial" w:eastAsia="Arial" w:hAnsi="Arial"/>
-                <w:sz w:val="20"/>
-                <w:szCs w:val="20"/>
-              </w:rPr>
-              <w:t xml:space="preserve">Should DigitalOcean automated backups be verified as part of the verification phase (requires DO API key)?</w:t>
-            </w:r>
-          </w:p>
-        </w:tc>
-        <w:tc>
-          <w:tcPr>
-            <w:tcW w:type="dxa" w:w="2000"/>
-            <w:tcBorders>
-              <w:top w:val="single" w:color="CCCCCC" w:sz="1"/>
-              <w:left w:val="single" w:color="CCCCCC" w:sz="1"/>
-              <w:bottom w:val="single" w:color="CCCCCC" w:sz="1"/>
-              <w:right w:val="single" w:color="CCCCCC" w:sz="1"/>
-            </w:tcBorders>
-            <w:tcMar>
-              <w:top w:type="dxa" w:w="80"/>
-              <w:left w:type="dxa" w:w="120"/>
-              <w:bottom w:type="dxa" w:w="80"/>
-              <w:right w:type="dxa" w:w="120"/>
-            </w:tcMar>
-          </w:tcPr>
-          <w:p>
-            <w:r>
-              <w:rPr>
-                <w:rFonts w:ascii="Arial" w:cs="Arial" w:eastAsia="Arial" w:hAnsi="Arial"/>
-                <w:sz w:val="20"/>
-                <w:szCs w:val="20"/>
-              </w:rPr>
-              <w:t xml:space="preserve">Open</w:t>
+            <w:tcW w:type="dxa" w:w="3200"/>
+            <w:tcBorders>
+              <w:top w:val="single" w:color="CCCCCC" w:sz="1"/>
+              <w:left w:val="single" w:color="CCCCCC" w:sz="1"/>
+              <w:bottom w:val="single" w:color="CCCCCC" w:sz="1"/>
+              <w:right w:val="single" w:color="CCCCCC" w:sz="1"/>
+            </w:tcBorders>
+            <w:tcMar>
+              <w:top w:type="dxa" w:w="80"/>
+              <w:left w:type="dxa" w:w="120"/>
+              <w:bottom w:type="dxa" w:w="80"/>
+              <w:right w:type="dxa" w:w="120"/>
+            </w:tcMar>
+          </w:tcPr>
+          <w:p>
+            <w:r>
+              <w:rPr>
+                <w:rFonts w:ascii="Arial" w:cs="Arial" w:eastAsia="Arial" w:hAnsi="Arial"/>
+                <w:sz w:val="20"/>
+                <w:szCs w:val="20"/>
+              </w:rPr>
+              <w:t xml:space="preserve">Should DigitalOcean automated backup verification be included (requires DO API key)?</w:t>
+            </w:r>
+          </w:p>
+        </w:tc>
+        <w:tc>
+          <w:tcPr>
+            <w:tcW w:type="dxa" w:w="1000"/>
+            <w:tcBorders>
+              <w:top w:val="single" w:color="CCCCCC" w:sz="1"/>
+              <w:left w:val="single" w:color="CCCCCC" w:sz="1"/>
+              <w:bottom w:val="single" w:color="CCCCCC" w:sz="1"/>
+              <w:right w:val="single" w:color="CCCCCC" w:sz="1"/>
+            </w:tcBorders>
+            <w:tcMar>
+              <w:top w:type="dxa" w:w="80"/>
+              <w:left w:type="dxa" w:w="120"/>
+              <w:bottom w:type="dxa" w:w="80"/>
+              <w:right w:type="dxa" w:w="120"/>
+            </w:tcMar>
+          </w:tcPr>
+          <w:p>
+            <w:r>
+              <w:rPr>
+                <w:rFonts w:ascii="Arial" w:cs="Arial" w:eastAsia="Arial" w:hAnsi="Arial"/>
+                <w:sz w:val="20"/>
+                <w:szCs w:val="20"/>
+              </w:rPr>
+              <w:t xml:space="preserve">Closed</w:t>
+            </w:r>
+          </w:p>
+        </w:tc>
+        <w:tc>
+          <w:tcPr>
+            <w:tcW w:type="dxa" w:w="3800"/>
+            <w:tcBorders>
+              <w:top w:val="single" w:color="CCCCCC" w:sz="1"/>
+              <w:left w:val="single" w:color="CCCCCC" w:sz="1"/>
+              <w:bottom w:val="single" w:color="CCCCCC" w:sz="1"/>
+              <w:right w:val="single" w:color="CCCCCC" w:sz="1"/>
+            </w:tcBorders>
+            <w:tcMar>
+              <w:top w:type="dxa" w:w="80"/>
+              <w:left w:type="dxa" w:w="120"/>
+              <w:bottom w:type="dxa" w:w="80"/>
+              <w:right w:type="dxa" w:w="120"/>
+            </w:tcMar>
+          </w:tcPr>
+          <w:p>
+            <w:r>
+              <w:rPr>
+                <w:rFonts w:ascii="Arial" w:cs="Arial" w:eastAsia="Arial" w:hAnsi="Arial"/>
+                <w:sz w:val="20"/>
+                <w:szCs w:val="20"/>
+              </w:rPr>
+              <w:t xml:space="preserve">Out of scope for v1.0</w:t>
             </w:r>
           </w:p>
         </w:tc>
@@ -8477,6 +9286,116 @@
           </w:p>
         </w:tc>
       </w:tr>
+      <w:tr>
+        <w:tc>
+          <w:tcPr>
+            <w:tcW w:type="dxa" w:w="1000"/>
+            <w:tcBorders>
+              <w:top w:val="single" w:color="CCCCCC" w:sz="1"/>
+              <w:left w:val="single" w:color="CCCCCC" w:sz="1"/>
+              <w:bottom w:val="single" w:color="CCCCCC" w:sz="1"/>
+              <w:right w:val="single" w:color="CCCCCC" w:sz="1"/>
+            </w:tcBorders>
+            <w:tcMar>
+              <w:top w:type="dxa" w:w="80"/>
+              <w:left w:type="dxa" w:w="120"/>
+              <w:bottom w:type="dxa" w:w="80"/>
+              <w:right w:type="dxa" w:w="120"/>
+            </w:tcMar>
+          </w:tcPr>
+          <w:p>
+            <w:r>
+              <w:rPr>
+                <w:rFonts w:ascii="Arial" w:cs="Arial" w:eastAsia="Arial" w:hAnsi="Arial"/>
+                <w:sz w:val="20"/>
+                <w:szCs w:val="20"/>
+              </w:rPr>
+              <w:t xml:space="preserve">0.3</w:t>
+            </w:r>
+          </w:p>
+        </w:tc>
+        <w:tc>
+          <w:tcPr>
+            <w:tcW w:type="dxa" w:w="1500"/>
+            <w:tcBorders>
+              <w:top w:val="single" w:color="CCCCCC" w:sz="1"/>
+              <w:left w:val="single" w:color="CCCCCC" w:sz="1"/>
+              <w:bottom w:val="single" w:color="CCCCCC" w:sz="1"/>
+              <w:right w:val="single" w:color="CCCCCC" w:sz="1"/>
+            </w:tcBorders>
+            <w:tcMar>
+              <w:top w:type="dxa" w:w="80"/>
+              <w:left w:type="dxa" w:w="120"/>
+              <w:bottom w:type="dxa" w:w="80"/>
+              <w:right w:type="dxa" w:w="120"/>
+            </w:tcMar>
+          </w:tcPr>
+          <w:p>
+            <w:r>
+              <w:rPr>
+                <w:rFonts w:ascii="Arial" w:cs="Arial" w:eastAsia="Arial" w:hAnsi="Arial"/>
+                <w:sz w:val="20"/>
+                <w:szCs w:val="20"/>
+              </w:rPr>
+              <w:t xml:space="preserve">March 2026</w:t>
+            </w:r>
+          </w:p>
+        </w:tc>
+        <w:tc>
+          <w:tcPr>
+            <w:tcW w:type="dxa" w:w="2000"/>
+            <w:tcBorders>
+              <w:top w:val="single" w:color="CCCCCC" w:sz="1"/>
+              <w:left w:val="single" w:color="CCCCCC" w:sz="1"/>
+              <w:bottom w:val="single" w:color="CCCCCC" w:sz="1"/>
+              <w:right w:val="single" w:color="CCCCCC" w:sz="1"/>
+            </w:tcBorders>
+            <w:tcMar>
+              <w:top w:type="dxa" w:w="80"/>
+              <w:left w:type="dxa" w:w="120"/>
+              <w:bottom w:type="dxa" w:w="80"/>
+              <w:right w:type="dxa" w:w="120"/>
+            </w:tcMar>
+          </w:tcPr>
+          <w:p>
+            <w:r>
+              <w:rPr>
+                <w:rFonts w:ascii="Arial" w:cs="Arial" w:eastAsia="Arial" w:hAnsi="Arial"/>
+                <w:sz w:val="20"/>
+                <w:szCs w:val="20"/>
+              </w:rPr>
+              <w:t xml:space="preserve">CBM / Claude</w:t>
+            </w:r>
+          </w:p>
+        </w:tc>
+        <w:tc>
+          <w:tcPr>
+            <w:tcW w:type="dxa" w:w="4860"/>
+            <w:tcBorders>
+              <w:top w:val="single" w:color="CCCCCC" w:sz="1"/>
+              <w:left w:val="single" w:color="CCCCCC" w:sz="1"/>
+              <w:bottom w:val="single" w:color="CCCCCC" w:sz="1"/>
+              <w:right w:val="single" w:color="CCCCCC" w:sz="1"/>
+            </w:tcBorders>
+            <w:tcMar>
+              <w:top w:type="dxa" w:w="80"/>
+              <w:left w:type="dxa" w:w="120"/>
+              <w:bottom w:type="dxa" w:w="80"/>
+              <w:right w:type="dxa" w:w="120"/>
+            </w:tcMar>
+          </w:tcPr>
+          <w:p>
+            <w:r>
+              <w:rPr>
+                <w:rFonts w:ascii="Arial" w:cs="Arial" w:eastAsia="Arial" w:hAnsi="Arial"/>
+                <w:sz w:val="20"/>
+                <w:szCs w:val="20"/>
+              </w:rPr>
+              <w:t xml:space="preserve">Closed open questions: cleanup/restart behavior, cbmadmin user, DO backup verification</w:t>
+            </w:r>
+          </w:p>
+        </w:tc>
+      </w:tr>
     </w:tbl>
     <w:p>
       <w:r>
@@ -8554,7 +9473,7 @@
         <w:sz w:val="18"/>
         <w:szCs w:val="18"/>
       </w:rPr>
-      <w:t xml:space="preserve">CONFIDENTIAL  |  v0.2  |  March 2026</w:t>
+      <w:t xml:space="preserve">CONFIDENTIAL  |  v0.3  |  March 2026</w:t>
     </w:r>
     <w:r>
       <w:rPr>
@@ -8766,6 +9685,12 @@
   </w:num>
   <w:num w:numId="2">
     <w:abstractNumId w:val="2"/>
+    <w:lvlOverride w:ilvl="0">
+      <w:startOverride w:val="1"/>
+    </w:lvlOverride>
+  </w:num>
+  <w:num w:numId="3">
+    <w:abstractNumId w:val="3"/>
     <w:lvlOverride w:ilvl="0">
       <w:startOverride w:val="1"/>
     </w:lvlOverride>

</xml_diff>